<commit_message>
docs: remove vendor name from feature overview
Make the feature overview fully vendor-neutral: 'not an Ericsson product'
-> 'not a commercial product', and 'Ericsson frames autonomous networks'
-> 'The telecom industry frames autonomous networks'. Regenerated .docx.
No tracked file now contains any vendor name.
</commit_message>
<xml_diff>
--- a/docs/FEATURE-OVERVIEW.docx
+++ b/docs/FEATURE-OVERVIEW.docx
@@ -103,7 +103,7 @@
         <w:t xml:space="preserve">sanitized data</w:t>
       </w:r>
       <w:r>
-        <w:t xml:space="preserve">. It is not an Ericsson product and contains no real customer,</w:t>
+        <w:t xml:space="preserve">. It is not a commercial product and contains no real customer,</w:t>
       </w:r>
       <w:r>
         <w:t xml:space="preserve"> </w:t>
@@ -849,43 +849,43 @@
         <w:pStyle w:val="FirstParagraph"/>
       </w:pPr>
       <w:r>
-        <w:t xml:space="preserve">Ericsson frames autonomous networks around</w:t>
-      </w:r>
-      <w:r>
-        <w:t xml:space="preserve"> </w:t>
-      </w:r>
-      <w:r>
-        <w:rPr>
-          <w:bCs/>
-          <w:b/>
-        </w:rPr>
-        <w:t xml:space="preserve">intent-driven, closed-loop</w:t>
-      </w:r>
-      <w:r>
-        <w:rPr>
-          <w:bCs/>
-          <w:b/>
-        </w:rPr>
-        <w:t xml:space="preserve"> </w:t>
-      </w:r>
-      <w:r>
-        <w:rPr>
-          <w:bCs/>
-          <w:b/>
-        </w:rPr>
-        <w:t xml:space="preserve">operations</w:t>
-      </w:r>
-      <w:r>
-        <w:t xml:space="preserve"> </w:t>
-      </w:r>
-      <w:r>
-        <w:t xml:space="preserve">across increasing levels of automation. Reaching higher autonomy</w:t>
-      </w:r>
-      <w:r>
-        <w:t xml:space="preserve"> </w:t>
-      </w:r>
-      <w:r>
-        <w:t xml:space="preserve">levels depends on machines being able to</w:t>
+        <w:t xml:space="preserve">The telecom industry frames autonomous networks around</w:t>
+      </w:r>
+      <w:r>
+        <w:t xml:space="preserve"> </w:t>
+      </w:r>
+      <w:r>
+        <w:rPr>
+          <w:bCs/>
+          <w:b/>
+        </w:rPr>
+        <w:t xml:space="preserve">intent-driven,</w:t>
+      </w:r>
+      <w:r>
+        <w:rPr>
+          <w:bCs/>
+          <w:b/>
+        </w:rPr>
+        <w:t xml:space="preserve"> </w:t>
+      </w:r>
+      <w:r>
+        <w:rPr>
+          <w:bCs/>
+          <w:b/>
+        </w:rPr>
+        <w:t xml:space="preserve">closed-loop operations</w:t>
+      </w:r>
+      <w:r>
+        <w:t xml:space="preserve"> </w:t>
+      </w:r>
+      <w:r>
+        <w:t xml:space="preserve">across increasing levels of automation. Reaching higher</w:t>
+      </w:r>
+      <w:r>
+        <w:t xml:space="preserve"> </w:t>
+      </w:r>
+      <w:r>
+        <w:t xml:space="preserve">autonomy levels depends on machines being able to</w:t>
       </w:r>
       <w:r>
         <w:t xml:space="preserve"> </w:t>
@@ -901,19 +901,13 @@
         <w:t xml:space="preserve"> </w:t>
       </w:r>
       <w:r>
-        <w:t xml:space="preserve">between</w:t>
-      </w:r>
-      <w:r>
-        <w:t xml:space="preserve"> </w:t>
-      </w:r>
-      <w:r>
-        <w:t xml:space="preserve">network state, changes, tests, faults, and knowledge — not just store documents.</w:t>
-      </w:r>
-      <w:r>
-        <w:t xml:space="preserve"> </w:t>
-      </w:r>
-      <w:r>
-        <w:t xml:space="preserve">This prototype demonstrates that reasoning pattern on the</w:t>
+        <w:t xml:space="preserve">between network state, changes, tests, faults, and knowledge — not just store</w:t>
+      </w:r>
+      <w:r>
+        <w:t xml:space="preserve"> </w:t>
+      </w:r>
+      <w:r>
+        <w:t xml:space="preserve">documents. This prototype demonstrates that reasoning pattern on the</w:t>
       </w:r>
       <w:r>
         <w:t xml:space="preserve"> </w:t>

</xml_diff>